<commit_message>
Create monthly to daily CPI rates
Update docs and add monthly to daily prompt, code and test
</commit_message>
<xml_diff>
--- a/PySupport/AdjustedNasdaq/docs/Prompt_CPI_Interpolation.docx
+++ b/PySupport/AdjustedNasdaq/docs/Prompt_CPI_Interpolation.docx
@@ -41,9 +41,22 @@
           <w:sz w:val="20"/>
           <w:szCs w:val="23"/>
         </w:rPr>
-        <w:t>fill_in_</w:t>
-      </w:r>
-      <w:proofErr w:type="gramStart"/>
+        <w:t>fill_in_missing</w:t>
+      </w:r>
+      <w:r>
+        <w:rPr>
+          <w:sz w:val="20"/>
+          <w:szCs w:val="23"/>
+        </w:rPr>
+        <w:t xml:space="preserve">“  </w:t>
+      </w:r>
+      <w:r>
+        <w:rPr>
+          <w:sz w:val="20"/>
+          <w:szCs w:val="23"/>
+        </w:rPr>
+        <w:t xml:space="preserve">in a module named </w:t>
+      </w:r>
       <w:r>
         <w:rPr>
           <w:b/>
@@ -51,22 +64,21 @@
           <w:sz w:val="20"/>
           <w:szCs w:val="23"/>
         </w:rPr>
-        <w:t>missing</w:t>
-      </w:r>
-      <w:r>
-        <w:rPr>
-          <w:sz w:val="20"/>
-          <w:szCs w:val="23"/>
-        </w:rPr>
-        <w:t xml:space="preserve">“  </w:t>
-      </w:r>
-      <w:proofErr w:type="gramEnd"/>
-      <w:r>
-        <w:rPr>
-          <w:sz w:val="20"/>
-          <w:szCs w:val="23"/>
-        </w:rPr>
-        <w:t xml:space="preserve">in a module named </w:t>
+        <w:t>interpolate.py</w:t>
+      </w:r>
+      <w:r>
+        <w:rPr>
+          <w:sz w:val="20"/>
+          <w:szCs w:val="23"/>
+        </w:rPr>
+        <w:t xml:space="preserve">. The function </w:t>
+      </w:r>
+      <w:r>
+        <w:rPr>
+          <w:sz w:val="20"/>
+          <w:szCs w:val="23"/>
+        </w:rPr>
+        <w:t>accepts a pandas dataframe parameter (</w:t>
       </w:r>
       <w:r>
         <w:rPr>
@@ -75,33 +87,8 @@
           <w:sz w:val="20"/>
           <w:szCs w:val="23"/>
         </w:rPr>
-        <w:t>interpolate.py</w:t>
-      </w:r>
-      <w:r>
-        <w:rPr>
-          <w:sz w:val="20"/>
-          <w:szCs w:val="23"/>
-        </w:rPr>
-        <w:t xml:space="preserve">. The function </w:t>
-      </w:r>
-      <w:r>
-        <w:rPr>
-          <w:sz w:val="20"/>
-          <w:szCs w:val="23"/>
-        </w:rPr>
-        <w:t>accepts a pandas dataframe parameter (</w:t>
-      </w:r>
-      <w:proofErr w:type="spellStart"/>
-      <w:r>
-        <w:rPr>
-          <w:b/>
-          <w:bCs/>
-          <w:sz w:val="20"/>
-          <w:szCs w:val="23"/>
-        </w:rPr>
         <w:t>df</w:t>
       </w:r>
-      <w:proofErr w:type="spellEnd"/>
       <w:r>
         <w:rPr>
           <w:sz w:val="20"/>
@@ -430,66 +417,20 @@
         </w:rPr>
         <w:t xml:space="preserve"> </w:t>
       </w:r>
-      <w:proofErr w:type="spellStart"/>
       <w:r>
         <w:rPr>
           <w:rFonts w:ascii="Lucida Console" w:hAnsi="Lucida Console"/>
-          <w:sz w:val="18"/>
+          <w:sz w:val="20"/>
           <w:szCs w:val="20"/>
         </w:rPr>
-        <w:t>augmented_df.set_index</w:t>
-      </w:r>
-      <w:proofErr w:type="spellEnd"/>
-      <w:r>
-        <w:rPr>
-          <w:rFonts w:ascii="Lucida Console" w:hAnsi="Lucida Console"/>
-          <w:sz w:val="18"/>
-          <w:szCs w:val="20"/>
-        </w:rPr>
-        <w:t>(</w:t>
-      </w:r>
-      <w:proofErr w:type="spellStart"/>
-      <w:r>
-        <w:rPr>
-          <w:rFonts w:ascii="Lucida Console" w:hAnsi="Lucida Console"/>
-          <w:sz w:val="18"/>
-          <w:szCs w:val="20"/>
-        </w:rPr>
-        <w:t>df</w:t>
-      </w:r>
-      <w:proofErr w:type="spellEnd"/>
-      <w:r>
-        <w:rPr>
-          <w:rFonts w:ascii="Lucida Console" w:hAnsi="Lucida Console"/>
-          <w:sz w:val="18"/>
-          <w:szCs w:val="20"/>
-        </w:rPr>
-        <w:t xml:space="preserve">[“date”], </w:t>
-      </w:r>
-      <w:proofErr w:type="spellStart"/>
-      <w:r>
-        <w:rPr>
-          <w:rFonts w:ascii="Lucida Console" w:hAnsi="Lucida Console"/>
-          <w:sz w:val="18"/>
-          <w:szCs w:val="20"/>
-        </w:rPr>
-        <w:t>inplace</w:t>
-      </w:r>
-      <w:proofErr w:type="spellEnd"/>
-      <w:r>
-        <w:rPr>
-          <w:rFonts w:ascii="Lucida Console" w:hAnsi="Lucida Console"/>
-          <w:sz w:val="18"/>
-          <w:szCs w:val="20"/>
-        </w:rPr>
-        <w:t>=True</w:t>
-      </w:r>
-      <w:r>
-        <w:rPr>
-          <w:sz w:val="20"/>
-          <w:szCs w:val="23"/>
-        </w:rPr>
-        <w:t>).</w:t>
+        <w:t>augmented_df.set_index(df[“date”], inplace=True)</w:t>
+      </w:r>
+      <w:r>
+        <w:rPr>
+          <w:sz w:val="20"/>
+          <w:szCs w:val="23"/>
+        </w:rPr>
+        <w:t>.</w:t>
       </w:r>
     </w:p>
     <w:p>
@@ -539,7 +480,6 @@
           <w:szCs w:val="23"/>
         </w:rPr>
       </w:pPr>
-      <w:proofErr w:type="spellStart"/>
       <w:r>
         <w:rPr>
           <w:rFonts w:ascii="Lucida Console" w:hAnsi="Lucida Console"/>
@@ -550,36 +490,14 @@
         </w:rPr>
         <w:t>Augmented_df</w:t>
       </w:r>
-      <w:proofErr w:type="spellEnd"/>
       <w:r>
         <w:rPr>
           <w:rFonts w:ascii="Lucida Console" w:hAnsi="Lucida Console"/>
           <w:sz w:val="18"/>
           <w:szCs w:val="20"/>
         </w:rPr>
-        <w:t xml:space="preserve">: </w:t>
-      </w:r>
-      <w:proofErr w:type="spellStart"/>
-      <w:proofErr w:type="gramStart"/>
-      <w:r>
-        <w:rPr>
-          <w:rFonts w:ascii="Lucida Console" w:hAnsi="Lucida Console"/>
-          <w:sz w:val="18"/>
-          <w:szCs w:val="20"/>
-        </w:rPr>
-        <w:t>pd.Dataframe</w:t>
-      </w:r>
-      <w:proofErr w:type="spellEnd"/>
-      <w:proofErr w:type="gramEnd"/>
-      <w:r>
-        <w:rPr>
-          <w:rFonts w:ascii="Lucida Console" w:hAnsi="Lucida Console"/>
-          <w:sz w:val="18"/>
-          <w:szCs w:val="20"/>
-        </w:rPr>
-        <w:t xml:space="preserve"> = </w:t>
-      </w:r>
-      <w:proofErr w:type="spellStart"/>
+        <w:t xml:space="preserve">: pd.Dataframe = </w:t>
+      </w:r>
       <w:r>
         <w:rPr>
           <w:rFonts w:ascii="Lucida Console" w:hAnsi="Lucida Console"/>
@@ -588,9 +506,16 @@
           <w:sz w:val="18"/>
           <w:szCs w:val="20"/>
         </w:rPr>
-        <w:t>fill_in_</w:t>
-      </w:r>
-      <w:proofErr w:type="gramStart"/>
+        <w:t>fill_in_missing</w:t>
+      </w:r>
+      <w:r>
+        <w:rPr>
+          <w:rFonts w:ascii="Lucida Console" w:hAnsi="Lucida Console"/>
+          <w:sz w:val="18"/>
+          <w:szCs w:val="20"/>
+        </w:rPr>
+        <w:t>(</w:t>
+      </w:r>
       <w:r>
         <w:rPr>
           <w:rFonts w:ascii="Lucida Console" w:hAnsi="Lucida Console"/>
@@ -599,77 +524,15 @@
           <w:sz w:val="18"/>
           <w:szCs w:val="20"/>
         </w:rPr>
-        <w:t>missing</w:t>
-      </w:r>
-      <w:proofErr w:type="spellEnd"/>
+        <w:t>fed_cpi_index</w:t>
+      </w:r>
       <w:r>
         <w:rPr>
           <w:rFonts w:ascii="Lucida Console" w:hAnsi="Lucida Console"/>
           <w:sz w:val="18"/>
           <w:szCs w:val="20"/>
         </w:rPr>
-        <w:t>(</w:t>
-      </w:r>
-      <w:proofErr w:type="spellStart"/>
-      <w:proofErr w:type="gramEnd"/>
-      <w:r>
-        <w:rPr>
-          <w:rFonts w:ascii="Lucida Console" w:hAnsi="Lucida Console"/>
-          <w:b/>
-          <w:bCs/>
-          <w:sz w:val="18"/>
-          <w:szCs w:val="20"/>
-        </w:rPr>
-        <w:t>fed_cpi_index</w:t>
-      </w:r>
-      <w:proofErr w:type="spellEnd"/>
-      <w:r>
-        <w:rPr>
-          <w:rFonts w:ascii="Lucida Console" w:hAnsi="Lucida Console"/>
-          <w:sz w:val="18"/>
-          <w:szCs w:val="20"/>
-        </w:rPr>
-        <w:t xml:space="preserve">: </w:t>
-      </w:r>
-      <w:proofErr w:type="spellStart"/>
-      <w:proofErr w:type="gramStart"/>
-      <w:r>
-        <w:rPr>
-          <w:rFonts w:ascii="Lucida Console" w:hAnsi="Lucida Console"/>
-          <w:sz w:val="18"/>
-          <w:szCs w:val="20"/>
-        </w:rPr>
-        <w:t>pd.Dataframe</w:t>
-      </w:r>
-      <w:proofErr w:type="spellEnd"/>
-      <w:proofErr w:type="gramEnd"/>
-      <w:r>
-        <w:rPr>
-          <w:rFonts w:ascii="Lucida Console" w:hAnsi="Lucida Console"/>
-          <w:sz w:val="18"/>
-          <w:szCs w:val="20"/>
-        </w:rPr>
-        <w:t xml:space="preserve">) -&gt; </w:t>
-      </w:r>
-      <w:proofErr w:type="spellStart"/>
-      <w:proofErr w:type="gramStart"/>
-      <w:r>
-        <w:rPr>
-          <w:rFonts w:ascii="Lucida Console" w:hAnsi="Lucida Console"/>
-          <w:sz w:val="18"/>
-          <w:szCs w:val="20"/>
-        </w:rPr>
-        <w:t>pd.Dataframe</w:t>
-      </w:r>
-      <w:proofErr w:type="spellEnd"/>
-      <w:proofErr w:type="gramEnd"/>
-      <w:r>
-        <w:rPr>
-          <w:rFonts w:ascii="Lucida Console" w:hAnsi="Lucida Console"/>
-          <w:sz w:val="18"/>
-          <w:szCs w:val="20"/>
-        </w:rPr>
-        <w:t>:</w:t>
+        <w:t>: pd.Dataframe) -&gt; pd.Dataframe:</w:t>
       </w:r>
     </w:p>
     <w:p>
@@ -688,7 +551,6 @@
         </w:rPr>
         <w:t>Sample CPI Input (</w:t>
       </w:r>
-      <w:proofErr w:type="spellStart"/>
       <w:r>
         <w:rPr>
           <w:b/>
@@ -698,7 +560,6 @@
         </w:rPr>
         <w:t>fed_cpi_index</w:t>
       </w:r>
-      <w:proofErr w:type="spellEnd"/>
       <w:r>
         <w:rPr>
           <w:sz w:val="23"/>
@@ -997,7 +858,6 @@
         </w:rPr>
         <w:t>Sample Function Return Value (</w:t>
       </w:r>
-      <w:proofErr w:type="spellStart"/>
       <w:r>
         <w:rPr>
           <w:b/>
@@ -1007,7 +867,6 @@
         </w:rPr>
         <w:t>Augmented_df</w:t>
       </w:r>
-      <w:proofErr w:type="spellEnd"/>
       <w:r>
         <w:rPr>
           <w:sz w:val="23"/>
@@ -1395,15 +1254,6 @@
         </w:rPr>
         <w:t>Implementation Notes</w:t>
       </w:r>
-    </w:p>
-    <w:p>
-      <w:pPr>
-        <w:spacing w:line="240" w:lineRule="auto"/>
-        <w:rPr>
-          <w:sz w:val="22"/>
-          <w:szCs w:val="22"/>
-        </w:rPr>
-      </w:pPr>
     </w:p>
     <w:p>
       <w:pPr>

</xml_diff>